<commit_message>
Note méthodologique sourdines et F1 (section cuivres HTML+DOCX) + analyse harmon détaillée
</commit_message>
<xml_diff>
--- a/Versions-html-and-docx/section_cuivres_v5.docx
+++ b/Versions-html-and-docx/section_cuivres_v5.docx
@@ -29551,6 +29551,16 @@
           <w:sz w:val="20"/>
         </w:rPr>
         <w:t>Les sourdines modifient profondément le profil formantique. Résultats analysés en technique ordinario (ou ordinario_open/closed pour les wah). Seuls les graphiques et descriptions sont fournis (sans tableau de techniques complet).</w:t>
+      </w:r>
+    </w:p>
+    <w:p>
+      <w:r>
+        <w:rPr>
+          <w:b w:val="0"/>
+          <w:i w:val="0"/>
+          <w:sz w:val="18"/>
+        </w:rPr>
+        <w:t>⚠ Note méthodologique — sourdines et F1 : les sourdines créent des résonances propres (cavité de la sourdine) qui peuvent dominer le spectre, particulièrement dans le registre aigu. Notre F1 (pic spectral le plus proéminent en médiane sur toute la tessiture) reflète cette résonance dominante, pas nécessairement la fondamentale de l'instrument. Exemple : la trompette harmon montre F1=2 358 Hz (résonance harmon), alors que les notes graves conservent de l'énergie à ~200–400 Hz. Le Fp (centroïde spectral) est dans ces cas un indicateur perceptif plus fiable, intégrant l'énergie sur l'ensemble du spectre.</w:t>
       </w:r>
     </w:p>
     <w:p>
@@ -29842,7 +29852,7 @@
           <w:i/>
           <w:sz w:val="20"/>
         </w:rPr>
-        <w:t>F1=2 358 Hz (+200 %) — tout le spectre propulsé dans la zone /i/. Son miles-davisien.</w:t>
+        <w:t>F1=2 358 Hz — la résonance de la sourdine harmon projette le pic spectral dominant dans la zone /i/. Attention : sur les notes graves (A♯3–C4), l'énergie spectrale reste centrée ~200–400 Hz (Δ=0 dB avec le pic global), mais sur la majorité de la tessiture (D♯4+), la résonance harmon à 3 000–5 000 Hz domine de 10 à 40 dB. La médiane F1 reflète cette dominance aiguë. Le Fp (centroïde = 1 443 Hz) capture mieux la perception d'un son "large mais nasillard" en intégrant l'énergie grave résiduelle et le pic harmon aigu.</w:t>
       </w:r>
     </w:p>
     <w:p>

</xml_diff>